<commit_message>
Add RASFF number of TIAC objects
Similar to what we have on SSA:
- Only can be added/updated by the AC
- Add filter
- Add in Docx and CSV
- Anyone can view
</commit_message>
<xml_diff>
--- a/tiac/doc_templates/evenement_simple.docx
+++ b/tiac/doc_templates/evenement_simple.docx
@@ -226,39 +226,7 @@
           <w:sz w:val="20"/>
           <w:szCs w:val="20"/>
         </w:rPr>
-        <w:t xml:space="preserve">Date de </w:t>
-      </w:r>
-      <w:r>
-        <w:rPr>
-          <w:rFonts w:cs="Calibri" w:ascii="Calibri" w:hAnsi="Calibri" w:asciiTheme="minorHAnsi" w:cstheme="minorHAnsi" w:hAnsiTheme="minorHAnsi"/>
-          <w:sz w:val="20"/>
-          <w:szCs w:val="20"/>
-        </w:rPr>
-        <w:t>publication</w:t>
-      </w:r>
-      <w:r>
-        <w:rPr>
-          <w:rFonts w:cs="Calibri" w:ascii="Calibri" w:hAnsi="Calibri" w:asciiTheme="minorHAnsi" w:cstheme="minorHAnsi" w:hAnsiTheme="minorHAnsi"/>
-          <w:sz w:val="20"/>
-          <w:szCs w:val="20"/>
-        </w:rPr>
-        <w:t>: {{object.date_</w:t>
-      </w:r>
-      <w:r>
-        <w:rPr>
-          <w:rFonts w:cs="Calibri" w:ascii="Calibri" w:hAnsi="Calibri" w:asciiTheme="minorHAnsi" w:cstheme="minorHAnsi" w:hAnsiTheme="minorHAnsi"/>
-          <w:sz w:val="20"/>
-          <w:szCs w:val="20"/>
-        </w:rPr>
-        <w:t>publication</w:t>
-      </w:r>
-      <w:r>
-        <w:rPr>
-          <w:rFonts w:cs="Calibri" w:ascii="Calibri" w:hAnsi="Calibri" w:asciiTheme="minorHAnsi" w:cstheme="minorHAnsi" w:hAnsiTheme="minorHAnsi"/>
-          <w:sz w:val="20"/>
-          <w:szCs w:val="20"/>
-        </w:rPr>
-        <w:t>.strftime("%Y-%m-%d %H:%M") }}</w:t>
+        <w:t>Date de publication: {{object.date_publication.strftime("%Y-%m-%d %H:%M") }}</w:t>
       </w:r>
     </w:p>
     <w:p>
@@ -313,6 +281,40 @@
           <w:szCs w:val="20"/>
         </w:rPr>
         <w:t>Modalités de déclaration : {{ object.get_modalites_declaration_display() }}</w:t>
+      </w:r>
+    </w:p>
+    <w:p>
+      <w:pPr>
+        <w:pStyle w:val="Corpsdetexte"/>
+        <w:rPr>
+          <w:rFonts w:ascii="Calibri" w:hAnsi="Calibri" w:cs="Calibri" w:asciiTheme="minorHAnsi" w:cstheme="minorHAnsi" w:hAnsiTheme="minorHAnsi"/>
+          <w:sz w:val="20"/>
+          <w:szCs w:val="20"/>
+        </w:rPr>
+      </w:pPr>
+      <w:r>
+        <w:rPr>
+          <w:rFonts w:cs="Calibri" w:ascii="Calibri" w:hAnsi="Calibri" w:asciiTheme="minorHAnsi" w:cstheme="minorHAnsi" w:hAnsiTheme="minorHAnsi"/>
+          <w:sz w:val="20"/>
+          <w:szCs w:val="20"/>
+        </w:rPr>
+        <w:t>N° RASFF/AAC : {{ object.</w:t>
+      </w:r>
+      <w:r>
+        <w:rPr>
+          <w:rFonts w:cs="Calibri" w:ascii="Calibri" w:hAnsi="Calibri" w:asciiTheme="minorHAnsi" w:cstheme="minorHAnsi" w:hAnsiTheme="minorHAnsi"/>
+          <w:sz w:val="20"/>
+          <w:szCs w:val="20"/>
+        </w:rPr>
+        <w:t>numero_rasff or ‘-’</w:t>
+      </w:r>
+      <w:r>
+        <w:rPr>
+          <w:rFonts w:cs="Calibri" w:ascii="Calibri" w:hAnsi="Calibri" w:asciiTheme="minorHAnsi" w:cstheme="minorHAnsi" w:hAnsiTheme="minorHAnsi"/>
+          <w:sz w:val="20"/>
+          <w:szCs w:val="20"/>
+        </w:rPr>
+        <w:t xml:space="preserve"> }}</w:t>
       </w:r>
     </w:p>
     <w:tbl>

</xml_diff>